<commit_message>
generated 50 state vignettes
</commit_message>
<xml_diff>
--- a/state-vignettes/alaska_highway_report.docx
+++ b/state-vignettes/alaska_highway_report.docx
@@ -7,71 +7,76 @@
         <w:pStyle w:val="Heading1"/>
       </w:pPr>
       <w:r>
-        <w:t>Alaska Ranks 50 in the Nation in Highway Performance and Cost-Effectiveness</w:t>
+        <w:rPr>
+          <w:color w:val="FF5500"/>
+        </w:rPr>
+        <w:t>Alaska Ranks 50th in the Nation in Highway Performance and Cost-Effectiveness</w:t>
       </w:r>
     </w:p>
     <w:p>
       <w:r>
-        <w:t>Alaska’s highway system ranks 50 in the nation in overall cost-effectiveness and condition.</w:t>
+        <w:t>Alaska’s highway system ranks 50th in the nation in overall cost-effectiveness and condition.</w:t>
       </w:r>
     </w:p>
     <w:p>
       <w:r>
-        <w:t xml:space="preserve">According to the Annual Highway Report by Reason Foundation, this is a change from the state's previous rankings. </w:t>
+        <w:t>According to the Annual Highway Report by Reason Foundation, this ranking is the same as last year’s.</w:t>
       </w:r>
     </w:p>
     <w:p>
       <w:r>
-        <w:t>In safety and condition categories, Alaska’s highways rank 8 in urban Interstate pavement condition, 48 in rural Interstate pavement condition, 16 in urban arterial pavement condition, 50 in rural arterial pavement condition, 37 in structurally deficient bridges, 11 in urban fatality rate, and 50 in rural fatality rate.</w:t>
+        <w:t>In safety and condition categories, Alaska’s highways rank 8th in urban Interstate pavement condition, 48th in rural Interstate pavement condition, 16th in urban arterial pavement condition, 50th in rural arterial pavement condition, 37th in structurally deficient bridges, 11th in urban fatality rate, and 50th in rural fatality rate.</w:t>
       </w:r>
     </w:p>
     <w:p>
       <w:r>
-        <w:t>Alaska ranks 10 out of the 50 states in traffic congestion, and its drivers spend 13.35 hours a year stuck in traffic congestion.</w:t>
+        <w:t>Alaska ranks 10th out of the 50 states in traffic congestion, and its drivers spend 13.35 hours a year stuck in traffic congestion.</w:t>
       </w:r>
     </w:p>
     <w:p>
       <w:r>
-        <w:t>In spending and cost-effectiveness, Alaska ranks 49 in capital and bridge disbursements, which are the costs of building new roads and bridges and widening existing ones. Alaska ranks 45 in maintenance spending, such as the costs of repaving roads and filling in potholes. Alaska’s administrative disbursements, including office spending that doesn’t make its way to roads, rank 21 nationwide.</w:t>
+        <w:t>In spending and cost-effectiveness, Alaska ranks 49th in capital and bridge disbursements, which are the costs of building new roads and bridges and widening existing ones. Alaska ranks 45th in maintenance spending, such as the costs of repaving roads and filling in potholes. Alaska’s administrative disbursements, including office spending that doesn’t make its way to roads, rank 21st nationwide.</w:t>
       </w:r>
     </w:p>
     <w:p>
       <w:r>
-        <w:t>Compared to last year, Alaska has the following notable changes in rankings: Urban Fatality Rate improved by 38.0 points, from 49 to 11; Maintenance Disbursements worsened by 5.0 points, from 40 to 45.</w:t>
+        <w:t>Compared to last year, Alaska has the following notable changes in rankings: Urban Fatality Rate improved by 38 points, from 49 to 11; Maintenance Disbursements worsened by 5 points, from 40 to 45.</w:t>
       </w:r>
     </w:p>
     <w:p>
       <w:r>
-        <w:t>Compared to other somewhat similar states, Alaska’s overall highway performance is worse than Washington (48), Wyoming (20), Oregon (33), Idaho (26), Hawaii (44), and Montana (22).</w:t>
+        <w:t>Compared to other somewhat similar states, Alaska’s overall highway performance is worse than Washington (48th), Wyoming (20th), Oregon (33rd), Idaho (26th), Hawaii (44th), and Montana (22nd).</w:t>
       </w:r>
     </w:p>
     <w:p>
       <w:r>
-        <w:t>Comparing its overall performance to similarly populated states, Alaska ranks worse than North Dakota (6) and Vermont (38).</w:t>
+        <w:t>Comparing its overall performance to similarly populated states, Alaska ranks worse than North Dakota (6th) and Vermont (38th).</w:t>
       </w:r>
     </w:p>
     <w:p>
       <w:r>
-        <w:t>Alaska’s highway system ranks 50 out of 50 states overall this year, compared to 50 last year.</w:t>
+        <w:t>Alaska’s highway system ranks 50th out of 50 states overall this year, the same ranking as last year.</w:t>
       </w:r>
     </w:p>
     <w:p>
       <w:r>
-        <w:t>“In terms of improving in the road condition and performance categories, Alaska should focus on reducing Rural Other Principal Arterial Pavement Condition and Rural Fatality Rate. Alaska’s rank of 50 in Rural Other Principal Arterial Pavement Condition makes it one of the worst in the nation for this safety metric,” said Baruch Feigenbaum, lead author of the 29th Annual Highway Report and senior managing director of transportation policy at Reason Foundation.</w:t>
+        <w:t>“In terms of improving in the road condition and performance categories, Alaska should focus on reducing Rural Other Principal Arterial Pavement Condition and Rural Fatality Rate. Alaska’s rank of 50th in Rural Other Principal Arterial Pavement Condition makes it one of the worst in the nation for this safety metric,” said Baruch Feigenbaum, lead author of the 29th Annual Highway Report and senior managing director of transportation policy at Reason Foundation.</w:t>
       </w:r>
     </w:p>
     <w:p>
-      <w:pPr>
-        <w:pStyle w:val="Heading2"/>
-      </w:pPr>
       <w:r>
+        <w:rPr>
+          <w:b/>
+          <w:color w:val="FF5500"/>
+          <w:sz w:val="28"/>
+        </w:rPr>
         <w:t>ALASKA’S RANKINGS IN THE 29TH ANNUAL HIGHWAY REPORT</w:t>
       </w:r>
     </w:p>
     <w:tbl>
       <w:tblPr>
-        <w:tblStyle w:val="TableGrid"/>
         <w:tblW w:type="auto" w:w="0"/>
+        <w:tblLayout w:type="autofit"/>
         <w:tblLook w:firstColumn="1" w:firstRow="1" w:lastColumn="0" w:lastRow="0" w:noHBand="0" w:noVBand="1" w:val="04A0"/>
       </w:tblPr>
       <w:tblGrid>
@@ -82,9 +87,15 @@
         <w:tc>
           <w:tcPr>
             <w:tcW w:type="dxa" w:w="4320"/>
+            <w:vAlign w:val="center"/>
           </w:tcPr>
           <w:p>
             <w:r>
+              <w:rPr>
+                <w:b/>
+                <w:color w:val="FF5500"/>
+                <w:sz w:val="22"/>
+              </w:rPr>
               <w:t>Category</w:t>
             </w:r>
           </w:p>
@@ -92,9 +103,18 @@
         <w:tc>
           <w:tcPr>
             <w:tcW w:type="dxa" w:w="4320"/>
+            <w:vAlign w:val="center"/>
           </w:tcPr>
           <w:p>
+            <w:pPr>
+              <w:jc w:val="right"/>
+            </w:pPr>
             <w:r>
+              <w:rPr>
+                <w:b/>
+                <w:color w:val="FF5500"/>
+                <w:sz w:val="22"/>
+              </w:rPr>
               <w:t>Rank</w:t>
             </w:r>
           </w:p>
@@ -104,9 +124,13 @@
         <w:tc>
           <w:tcPr>
             <w:tcW w:type="dxa" w:w="4320"/>
+            <w:shd w:fill="F0F0F0"/>
           </w:tcPr>
           <w:p>
             <w:r>
+              <w:rPr>
+                <w:sz w:val="20"/>
+              </w:rPr>
               <w:t>Overall</w:t>
             </w:r>
           </w:p>
@@ -114,9 +138,16 @@
         <w:tc>
           <w:tcPr>
             <w:tcW w:type="dxa" w:w="4320"/>
+            <w:shd w:fill="F0F0F0"/>
           </w:tcPr>
           <w:p>
+            <w:pPr>
+              <w:jc w:val="right"/>
+            </w:pPr>
             <w:r>
+              <w:rPr>
+                <w:sz w:val="20"/>
+              </w:rPr>
               <w:t>50</w:t>
             </w:r>
           </w:p>
@@ -129,6 +160,9 @@
           </w:tcPr>
           <w:p>
             <w:r>
+              <w:rPr>
+                <w:sz w:val="20"/>
+              </w:rPr>
               <w:t>Capital &amp; Bridge Disbursements</w:t>
             </w:r>
           </w:p>
@@ -138,7 +172,13 @@
             <w:tcW w:type="dxa" w:w="4320"/>
           </w:tcPr>
           <w:p>
+            <w:pPr>
+              <w:jc w:val="right"/>
+            </w:pPr>
             <w:r>
+              <w:rPr>
+                <w:sz w:val="20"/>
+              </w:rPr>
               <w:t>49</w:t>
             </w:r>
           </w:p>
@@ -148,9 +188,13 @@
         <w:tc>
           <w:tcPr>
             <w:tcW w:type="dxa" w:w="4320"/>
+            <w:shd w:fill="F0F0F0"/>
           </w:tcPr>
           <w:p>
             <w:r>
+              <w:rPr>
+                <w:sz w:val="20"/>
+              </w:rPr>
               <w:t>Maintenance Disbursements</w:t>
             </w:r>
           </w:p>
@@ -158,9 +202,16 @@
         <w:tc>
           <w:tcPr>
             <w:tcW w:type="dxa" w:w="4320"/>
+            <w:shd w:fill="F0F0F0"/>
           </w:tcPr>
           <w:p>
+            <w:pPr>
+              <w:jc w:val="right"/>
+            </w:pPr>
             <w:r>
+              <w:rPr>
+                <w:sz w:val="20"/>
+              </w:rPr>
               <w:t>45</w:t>
             </w:r>
           </w:p>
@@ -173,6 +224,9 @@
           </w:tcPr>
           <w:p>
             <w:r>
+              <w:rPr>
+                <w:sz w:val="20"/>
+              </w:rPr>
               <w:t>Administrative Disbursements</w:t>
             </w:r>
           </w:p>
@@ -182,7 +236,13 @@
             <w:tcW w:type="dxa" w:w="4320"/>
           </w:tcPr>
           <w:p>
+            <w:pPr>
+              <w:jc w:val="right"/>
+            </w:pPr>
             <w:r>
+              <w:rPr>
+                <w:sz w:val="20"/>
+              </w:rPr>
               <w:t>21</w:t>
             </w:r>
           </w:p>
@@ -192,9 +252,13 @@
         <w:tc>
           <w:tcPr>
             <w:tcW w:type="dxa" w:w="4320"/>
+            <w:shd w:fill="F0F0F0"/>
           </w:tcPr>
           <w:p>
             <w:r>
+              <w:rPr>
+                <w:sz w:val="20"/>
+              </w:rPr>
               <w:t>Other Disbursements</w:t>
             </w:r>
           </w:p>
@@ -202,9 +266,16 @@
         <w:tc>
           <w:tcPr>
             <w:tcW w:type="dxa" w:w="4320"/>
+            <w:shd w:fill="F0F0F0"/>
           </w:tcPr>
           <w:p>
+            <w:pPr>
+              <w:jc w:val="right"/>
+            </w:pPr>
             <w:r>
+              <w:rPr>
+                <w:sz w:val="20"/>
+              </w:rPr>
               <w:t>28</w:t>
             </w:r>
           </w:p>
@@ -217,6 +288,9 @@
           </w:tcPr>
           <w:p>
             <w:r>
+              <w:rPr>
+                <w:sz w:val="20"/>
+              </w:rPr>
               <w:t>Rural Interstate Pavement Condition</w:t>
             </w:r>
           </w:p>
@@ -226,7 +300,13 @@
             <w:tcW w:type="dxa" w:w="4320"/>
           </w:tcPr>
           <w:p>
+            <w:pPr>
+              <w:jc w:val="right"/>
+            </w:pPr>
             <w:r>
+              <w:rPr>
+                <w:sz w:val="20"/>
+              </w:rPr>
               <w:t>48</w:t>
             </w:r>
           </w:p>
@@ -236,9 +316,13 @@
         <w:tc>
           <w:tcPr>
             <w:tcW w:type="dxa" w:w="4320"/>
+            <w:shd w:fill="F0F0F0"/>
           </w:tcPr>
           <w:p>
             <w:r>
+              <w:rPr>
+                <w:sz w:val="20"/>
+              </w:rPr>
               <w:t>Rural Other Principal Arterial Pavement Condition</w:t>
             </w:r>
           </w:p>
@@ -246,9 +330,16 @@
         <w:tc>
           <w:tcPr>
             <w:tcW w:type="dxa" w:w="4320"/>
+            <w:shd w:fill="F0F0F0"/>
           </w:tcPr>
           <w:p>
+            <w:pPr>
+              <w:jc w:val="right"/>
+            </w:pPr>
             <w:r>
+              <w:rPr>
+                <w:sz w:val="20"/>
+              </w:rPr>
               <w:t>50</w:t>
             </w:r>
           </w:p>
@@ -261,6 +352,9 @@
           </w:tcPr>
           <w:p>
             <w:r>
+              <w:rPr>
+                <w:sz w:val="20"/>
+              </w:rPr>
               <w:t>Urban Interstate Pavement Condition</w:t>
             </w:r>
           </w:p>
@@ -270,7 +364,13 @@
             <w:tcW w:type="dxa" w:w="4320"/>
           </w:tcPr>
           <w:p>
+            <w:pPr>
+              <w:jc w:val="right"/>
+            </w:pPr>
             <w:r>
+              <w:rPr>
+                <w:sz w:val="20"/>
+              </w:rPr>
               <w:t>8</w:t>
             </w:r>
           </w:p>
@@ -280,9 +380,13 @@
         <w:tc>
           <w:tcPr>
             <w:tcW w:type="dxa" w:w="4320"/>
+            <w:shd w:fill="F0F0F0"/>
           </w:tcPr>
           <w:p>
             <w:r>
+              <w:rPr>
+                <w:sz w:val="20"/>
+              </w:rPr>
               <w:t>Urban Other Principal Arterial Pavement Condition</w:t>
             </w:r>
           </w:p>
@@ -290,9 +394,16 @@
         <w:tc>
           <w:tcPr>
             <w:tcW w:type="dxa" w:w="4320"/>
+            <w:shd w:fill="F0F0F0"/>
           </w:tcPr>
           <w:p>
+            <w:pPr>
+              <w:jc w:val="right"/>
+            </w:pPr>
             <w:r>
+              <w:rPr>
+                <w:sz w:val="20"/>
+              </w:rPr>
               <w:t>16</w:t>
             </w:r>
           </w:p>
@@ -305,6 +416,9 @@
           </w:tcPr>
           <w:p>
             <w:r>
+              <w:rPr>
+                <w:sz w:val="20"/>
+              </w:rPr>
               <w:t>Urbanized Area Congestion</w:t>
             </w:r>
           </w:p>
@@ -314,7 +428,13 @@
             <w:tcW w:type="dxa" w:w="4320"/>
           </w:tcPr>
           <w:p>
+            <w:pPr>
+              <w:jc w:val="right"/>
+            </w:pPr>
             <w:r>
+              <w:rPr>
+                <w:sz w:val="20"/>
+              </w:rPr>
               <w:t>10</w:t>
             </w:r>
           </w:p>
@@ -324,9 +444,13 @@
         <w:tc>
           <w:tcPr>
             <w:tcW w:type="dxa" w:w="4320"/>
+            <w:shd w:fill="F0F0F0"/>
           </w:tcPr>
           <w:p>
             <w:r>
+              <w:rPr>
+                <w:sz w:val="20"/>
+              </w:rPr>
               <w:t>Structurally Deficient Bridges</w:t>
             </w:r>
           </w:p>
@@ -334,9 +458,16 @@
         <w:tc>
           <w:tcPr>
             <w:tcW w:type="dxa" w:w="4320"/>
+            <w:shd w:fill="F0F0F0"/>
           </w:tcPr>
           <w:p>
+            <w:pPr>
+              <w:jc w:val="right"/>
+            </w:pPr>
             <w:r>
+              <w:rPr>
+                <w:sz w:val="20"/>
+              </w:rPr>
               <w:t>37</w:t>
             </w:r>
           </w:p>
@@ -349,6 +480,9 @@
           </w:tcPr>
           <w:p>
             <w:r>
+              <w:rPr>
+                <w:sz w:val="20"/>
+              </w:rPr>
               <w:t>Rural Fatality Rate</w:t>
             </w:r>
           </w:p>
@@ -358,7 +492,13 @@
             <w:tcW w:type="dxa" w:w="4320"/>
           </w:tcPr>
           <w:p>
+            <w:pPr>
+              <w:jc w:val="right"/>
+            </w:pPr>
             <w:r>
+              <w:rPr>
+                <w:sz w:val="20"/>
+              </w:rPr>
               <w:t>50</w:t>
             </w:r>
           </w:p>
@@ -368,9 +508,13 @@
         <w:tc>
           <w:tcPr>
             <w:tcW w:type="dxa" w:w="4320"/>
+            <w:shd w:fill="F0F0F0"/>
           </w:tcPr>
           <w:p>
             <w:r>
+              <w:rPr>
+                <w:sz w:val="20"/>
+              </w:rPr>
               <w:t>Urban Fatality Rate</w:t>
             </w:r>
           </w:p>
@@ -378,9 +522,16 @@
         <w:tc>
           <w:tcPr>
             <w:tcW w:type="dxa" w:w="4320"/>
+            <w:shd w:fill="F0F0F0"/>
           </w:tcPr>
           <w:p>
+            <w:pPr>
+              <w:jc w:val="right"/>
+            </w:pPr>
             <w:r>
+              <w:rPr>
+                <w:sz w:val="20"/>
+              </w:rPr>
               <w:t>11</w:t>
             </w:r>
           </w:p>
@@ -393,6 +544,9 @@
           </w:tcPr>
           <w:p>
             <w:r>
+              <w:rPr>
+                <w:sz w:val="20"/>
+              </w:rPr>
               <w:t>Other Fatality Rate</w:t>
             </w:r>
           </w:p>
@@ -402,7 +556,13 @@
             <w:tcW w:type="dxa" w:w="4320"/>
           </w:tcPr>
           <w:p>
+            <w:pPr>
+              <w:jc w:val="right"/>
+            </w:pPr>
             <w:r>
+              <w:rPr>
+                <w:sz w:val="20"/>
+              </w:rPr>
               <w:t>5</w:t>
             </w:r>
           </w:p>

</xml_diff>